<commit_message>
Reuploaded exp - 9
</commit_message>
<xml_diff>
--- a/Experiment-9/Experiment-9.docx
+++ b/Experiment-9/Experiment-9.docx
@@ -45,7 +45,7 @@
         <w:rPr>
           <w:lang w:val="en-GB"/>
         </w:rPr>
-        <w:t xml:space="preserve">Student Name: </w:t>
+        <w:t>Student Name:</w:t>
       </w:r>
       <w:r>
         <w:rPr>
@@ -182,7 +182,19 @@
         <w:rPr>
           <w:lang w:val="en-GB"/>
         </w:rPr>
-        <w:t xml:space="preserve"> 1/4</w:t>
+        <w:t xml:space="preserve"> 1</w:t>
+      </w:r>
+      <w:r>
+        <w:rPr>
+          <w:lang w:val="en-GB"/>
+        </w:rPr>
+        <w:t>7</w:t>
+      </w:r>
+      <w:r>
+        <w:rPr>
+          <w:lang w:val="en-GB"/>
+        </w:rPr>
+        <w:t>/4</w:t>
       </w:r>
       <w:r>
         <w:rPr>
@@ -277,7 +289,19 @@
         <w:rPr>
           <w:lang w:val="en-GB"/>
         </w:rPr>
-        <w:t>To understand and implement database triggers in PostgreSQL to automate data validation and computational logic, ensuring data integrity by enforcing business rules during DML operations.</w:t>
+        <w:t>To create and implement PL/SQL packages by developing a package specification and package body containing procedures and shared cursors, in order to achieve modular, reusable, and</w:t>
+      </w:r>
+      <w:r>
+        <w:rPr>
+          <w:lang w:val="en-GB"/>
+        </w:rPr>
+        <w:t xml:space="preserve"> efficient database programming</w:t>
+      </w:r>
+      <w:r>
+        <w:rPr>
+          <w:lang w:val="en-GB"/>
+        </w:rPr>
+        <w:t>.</w:t>
       </w:r>
     </w:p>
     <w:p>
@@ -408,19 +432,11 @@
           <w:lang w:val="en-GB"/>
         </w:rPr>
       </w:pPr>
-      <w:proofErr w:type="spellStart"/>
-      <w:r>
-        <w:rPr>
-          <w:lang w:val="en-GB"/>
-        </w:rPr>
-        <w:t>pgAdmin</w:t>
-      </w:r>
-      <w:proofErr w:type="spellEnd"/>
-      <w:r>
-        <w:rPr>
-          <w:lang w:val="en-GB"/>
-        </w:rPr>
-        <w:t xml:space="preserve"> (for PostgreSQL)</w:t>
+      <w:r>
+        <w:rPr>
+          <w:lang w:val="en-GB"/>
+        </w:rPr>
+        <w:t>pgAdmin (for PostgreSQL)</w:t>
       </w:r>
     </w:p>
     <w:p>
@@ -487,7 +503,34 @@
         <w:rPr>
           <w:lang w:val="en-GB"/>
         </w:rPr>
-        <w:t>To create a trigger function that performs automatic calculations on row-level data.</w:t>
+        <w:t>To design and implement a PL/SQL package that includes procedures and shared cursors for structured and modular program development.</w:t>
+      </w:r>
+    </w:p>
+    <w:p>
+      <w:pPr>
+        <w:pStyle w:val="Heading3"/>
+        <w:keepNext w:val="0"/>
+        <w:keepLines w:val="0"/>
+        <w:spacing w:before="280"/>
+        <w:rPr>
+          <w:b/>
+          <w:bCs/>
+          <w:color w:val="000000"/>
+          <w:sz w:val="36"/>
+          <w:szCs w:val="36"/>
+          <w:lang w:val="en-GB"/>
+        </w:rPr>
+      </w:pPr>
+      <w:r>
+        <w:rPr>
+          <w:b/>
+          <w:bCs/>
+          <w:color w:val="000000"/>
+          <w:sz w:val="36"/>
+          <w:szCs w:val="36"/>
+          <w:lang w:val="en-GB"/>
+        </w:rPr>
+        <w:t>Problem Statement</w:t>
       </w:r>
     </w:p>
     <w:p>
@@ -505,43 +548,7 @@
         <w:rPr>
           <w:lang w:val="en-GB"/>
         </w:rPr>
-        <w:t>To define a BEFORE INSERT trigger that intercepts data entry for validation.</w:t>
-      </w:r>
-    </w:p>
-    <w:p>
-      <w:pPr>
-        <w:pStyle w:val="NoSpacing"/>
-        <w:numPr>
-          <w:ilvl w:val="0"/>
-          <w:numId w:val="19"/>
-        </w:numPr>
-        <w:rPr>
-          <w:lang w:val="en-GB"/>
-        </w:rPr>
-      </w:pPr>
-      <w:r>
-        <w:rPr>
-          <w:lang w:val="en-GB"/>
-        </w:rPr>
-        <w:t>To implement custom exception handling using the RAISE EXCEPTION command.</w:t>
-      </w:r>
-    </w:p>
-    <w:p>
-      <w:pPr>
-        <w:pStyle w:val="NoSpacing"/>
-        <w:numPr>
-          <w:ilvl w:val="0"/>
-          <w:numId w:val="19"/>
-        </w:numPr>
-        <w:rPr>
-          <w:lang w:val="en-GB"/>
-        </w:rPr>
-      </w:pPr>
-      <w:r>
-        <w:rPr>
-          <w:lang w:val="en-GB"/>
-        </w:rPr>
-        <w:t>To verify trigger behaviour by testing both valid and invalid data scenarios within a transaction.</w:t>
+        <w:t>In enterprise applications, related database operations should be grouped together for better management and reuse.</w:t>
       </w:r>
     </w:p>
     <w:p>
@@ -594,8 +601,7 @@
         <w:rPr>
           <w:lang w:val="en-GB"/>
         </w:rPr>
-        <w:lastRenderedPageBreak/>
-        <w:t>Schema Provisioning: Established the employee table with dedicated columns for base data (hours and rate) and a calculated column for the final payable amount.</w:t>
+        <w:t>Modular Architecture Design: Structured the database logic into a two-part PL/SQL package consisting of a public specification and a private implementation body.</w:t>
       </w:r>
     </w:p>
     <w:p>
@@ -603,7 +609,7 @@
         <w:pStyle w:val="NoSpacing"/>
         <w:numPr>
           <w:ilvl w:val="0"/>
-          <w:numId w:val="20"/>
+          <w:numId w:val="21"/>
         </w:numPr>
         <w:rPr>
           <w:lang w:val="en-GB"/>
@@ -613,21 +619,8 @@
         <w:rPr>
           <w:lang w:val="en-GB"/>
         </w:rPr>
-        <w:t>Trigger Function Development: Authored a PL/</w:t>
-      </w:r>
-      <w:proofErr w:type="spellStart"/>
-      <w:r>
-        <w:rPr>
-          <w:lang w:val="en-GB"/>
-        </w:rPr>
-        <w:t>pgSQL</w:t>
-      </w:r>
-      <w:proofErr w:type="spellEnd"/>
-      <w:r>
-        <w:rPr>
-          <w:lang w:val="en-GB"/>
-        </w:rPr>
-        <w:t xml:space="preserve"> function designed to calculate the product of working hours and hourly rates dynamically.</w:t>
+        <w:lastRenderedPageBreak/>
+        <w:t>Encapsulation of Global Assets: Defined a shared cursor within the package body to provide a centralized and reusable data source for multiple procedures.</w:t>
       </w:r>
     </w:p>
     <w:p>
@@ -635,7 +628,7 @@
         <w:pStyle w:val="NoSpacing"/>
         <w:numPr>
           <w:ilvl w:val="0"/>
-          <w:numId w:val="20"/>
+          <w:numId w:val="21"/>
         </w:numPr>
         <w:rPr>
           <w:lang w:val="en-GB"/>
@@ -645,7 +638,7 @@
         <w:rPr>
           <w:lang w:val="en-GB"/>
         </w:rPr>
-        <w:t>Automated Validation Logic: Embedded a conditional check within the function to prevent the insertion of records where the calculated amount exceeds a predefined limit.</w:t>
+        <w:t>Procedural Logic Development: Authored specialized procedures to handle varied data retrieval tasks, including full table iteration and targeted record searching.</w:t>
       </w:r>
     </w:p>
     <w:p>
@@ -653,7 +646,7 @@
         <w:pStyle w:val="NoSpacing"/>
         <w:numPr>
           <w:ilvl w:val="0"/>
-          <w:numId w:val="20"/>
+          <w:numId w:val="21"/>
         </w:numPr>
         <w:rPr>
           <w:lang w:val="en-GB"/>
@@ -663,7 +656,7 @@
         <w:rPr>
           <w:lang w:val="en-GB"/>
         </w:rPr>
-        <w:t>Trigger Binding: Configured a row-level trigger to execute the function specifically BEFORE any INSERT operation occurs on the table.</w:t>
+        <w:t>Information Hiding Implementation: Enforced security and abstraction by hiding the internal cursor logic from the end-user while exposing only necessary procedure calls.</w:t>
       </w:r>
     </w:p>
     <w:p>
@@ -671,7 +664,7 @@
         <w:pStyle w:val="NoSpacing"/>
         <w:numPr>
           <w:ilvl w:val="0"/>
-          <w:numId w:val="20"/>
+          <w:numId w:val="21"/>
         </w:numPr>
         <w:rPr>
           <w:lang w:val="en-GB"/>
@@ -681,7 +674,7 @@
         <w:rPr>
           <w:lang w:val="en-GB"/>
         </w:rPr>
-        <w:t>Operational Stress Testing: Utilized anonymous DO blocks to simulate data entry and verify that the system correctly identifies and blocks prohibited transactions.</w:t>
+        <w:t>Integration Testing: Executed the package subprograms within anonymous blocks to validate cross-procedure consistency and data accuracy.</w:t>
       </w:r>
     </w:p>
     <w:p>
@@ -724,7 +717,7 @@
         <w:rPr>
           <w:lang w:val="en-GB"/>
         </w:rPr>
-        <w:t>Accessed the PostgreSQL console and created the employee table structure.</w:t>
+        <w:t>Established a connection to the Oracle/PostgreSQL environment and enabled the output console for result verification.</w:t>
       </w:r>
     </w:p>
     <w:p>
@@ -742,21 +735,7 @@
         <w:rPr>
           <w:lang w:val="en-GB"/>
         </w:rPr>
-        <w:t>Defined the CALCULATE_</w:t>
-      </w:r>
-      <w:proofErr w:type="gramStart"/>
-      <w:r>
-        <w:rPr>
-          <w:lang w:val="en-GB"/>
-        </w:rPr>
-        <w:t>AMOUNT(</w:t>
-      </w:r>
-      <w:proofErr w:type="gramEnd"/>
-      <w:r>
-        <w:rPr>
-          <w:lang w:val="en-GB"/>
-        </w:rPr>
-        <w:t>) function using the NEW keyword to access and modify incoming row data before it is written to the disk.</w:t>
+        <w:t>Created the employees table and populated it with a baseline dataset to facilitate testing.</w:t>
       </w:r>
     </w:p>
     <w:p>
@@ -774,21 +753,7 @@
         <w:rPr>
           <w:lang w:val="en-GB"/>
         </w:rPr>
-        <w:t xml:space="preserve">Integrated a mathematical formula to populate the </w:t>
-      </w:r>
-      <w:proofErr w:type="spellStart"/>
-      <w:r>
-        <w:rPr>
-          <w:lang w:val="en-GB"/>
-        </w:rPr>
-        <w:t>total_payable_amount</w:t>
-      </w:r>
-      <w:proofErr w:type="spellEnd"/>
-      <w:r>
-        <w:rPr>
-          <w:lang w:val="en-GB"/>
-        </w:rPr>
-        <w:t xml:space="preserve"> field automatically.</w:t>
+        <w:t>Drafted the Package Specification (emp_package AS) to declare the public interface of the procedures.</w:t>
       </w:r>
     </w:p>
     <w:p>
@@ -806,7 +771,7 @@
         <w:rPr>
           <w:lang w:val="en-GB"/>
         </w:rPr>
-        <w:t>Created the CAL_PAYABLE_AMOUNT trigger, ensuring it was set to FOR EACH ROW to evaluate every individual record.</w:t>
+        <w:t>Constructed the Package Body (emp_package AS BODY) to house the shared emp_cursor and the actual logic for the declared procedures.</w:t>
       </w:r>
     </w:p>
     <w:p>
@@ -824,7 +789,7 @@
         <w:rPr>
           <w:lang w:val="en-GB"/>
         </w:rPr>
-        <w:t>Executed a successful INSERT test case where the calculated result was below 25,000 to confirm normal operations.</w:t>
+        <w:t>Implemented a FOR loop within show_employees to automatically handle the opening, fetching, and closing of the shared cursor.</w:t>
       </w:r>
     </w:p>
     <w:p>
@@ -842,7 +807,7 @@
         <w:rPr>
           <w:lang w:val="en-GB"/>
         </w:rPr>
-        <w:t>Ran a SELECT query to verify that the trigger correctly computed and stored the total amount despite it not being provided in the INSERT statement.</w:t>
+        <w:t>Developed the logic for get_employee to filter the shared cursor data based on a user-provided input parameter.</w:t>
       </w:r>
     </w:p>
     <w:p>
@@ -860,7 +825,7 @@
         <w:rPr>
           <w:lang w:val="en-GB"/>
         </w:rPr>
-        <w:t>Attempted an invalid INSERT with values resulting in an amount over 25,000 to trigger the custom exception.</w:t>
+        <w:t>Compiled both the specification and body to ensure there were no syntax errors or dependency issues.</w:t>
       </w:r>
     </w:p>
     <w:p>
@@ -878,7 +843,7 @@
         <w:rPr>
           <w:lang w:val="en-GB"/>
         </w:rPr>
-        <w:t>Implemented exception handling in the test blocks to capture and display the SQLERRM (error message) generated by the trigger.</w:t>
+        <w:t>Invoked emp_package.show_employees to test global data retrieval and printed the formatted output.</w:t>
       </w:r>
     </w:p>
     <w:p>
@@ -896,13 +861,7 @@
         <w:rPr>
           <w:lang w:val="en-GB"/>
         </w:rPr>
-        <w:t>Analysed</w:t>
-      </w:r>
-      <w:r>
-        <w:rPr>
-          <w:lang w:val="en-GB"/>
-        </w:rPr>
-        <w:t xml:space="preserve"> the final table state to confirm that the invalid record was successfully blocked by the trigger logic.</w:t>
+        <w:t>Called emp_package.get_employee(2) to verify the ability of the package to handle specific conditional requests using shared resources.</w:t>
       </w:r>
     </w:p>
     <w:p>
@@ -964,7 +923,23 @@
         <w:pStyle w:val="NoSpacing"/>
       </w:pPr>
       <w:r>
-        <w:t>CREATE TABLE employee (</w:t>
+        <w:t>CREATE TABLE employees (</w:t>
+      </w:r>
+    </w:p>
+    <w:p>
+      <w:pPr>
+        <w:pStyle w:val="NoSpacing"/>
+      </w:pPr>
+      <w:r>
+        <w:t xml:space="preserve">    emp_id NUMBER PRIMARY KEY,</w:t>
+      </w:r>
+    </w:p>
+    <w:p>
+      <w:pPr>
+        <w:pStyle w:val="NoSpacing"/>
+      </w:pPr>
+      <w:r>
+        <w:t xml:space="preserve">    emp_name VARCHAR2(50),</w:t>
       </w:r>
     </w:p>
     <w:p>
@@ -973,87 +948,7 @@
       </w:pPr>
       <w:r>
         <w:lastRenderedPageBreak/>
-        <w:t xml:space="preserve">    </w:t>
-      </w:r>
-      <w:proofErr w:type="spellStart"/>
-      <w:r>
-        <w:t>emp_id</w:t>
-      </w:r>
-      <w:proofErr w:type="spellEnd"/>
-      <w:r>
-        <w:t xml:space="preserve"> INT PRIMARY KEY,</w:t>
-      </w:r>
-    </w:p>
-    <w:p>
-      <w:pPr>
-        <w:pStyle w:val="NoSpacing"/>
-      </w:pPr>
-      <w:r>
-        <w:t xml:space="preserve">    </w:t>
-      </w:r>
-      <w:proofErr w:type="spellStart"/>
-      <w:r>
-        <w:t>emp_name</w:t>
-      </w:r>
-      <w:proofErr w:type="spellEnd"/>
-      <w:r>
-        <w:t xml:space="preserve"> </w:t>
-      </w:r>
-      <w:proofErr w:type="gramStart"/>
-      <w:r>
-        <w:t>VARCHAR(</w:t>
-      </w:r>
-      <w:proofErr w:type="gramEnd"/>
-      <w:r>
-        <w:t>50),</w:t>
-      </w:r>
-    </w:p>
-    <w:p>
-      <w:pPr>
-        <w:pStyle w:val="NoSpacing"/>
-      </w:pPr>
-      <w:r>
-        <w:t xml:space="preserve">    </w:t>
-      </w:r>
-      <w:proofErr w:type="spellStart"/>
-      <w:r>
-        <w:t>working_hours</w:t>
-      </w:r>
-      <w:proofErr w:type="spellEnd"/>
-      <w:r>
-        <w:t xml:space="preserve"> INT,</w:t>
-      </w:r>
-    </w:p>
-    <w:p>
-      <w:pPr>
-        <w:pStyle w:val="NoSpacing"/>
-      </w:pPr>
-      <w:r>
-        <w:t xml:space="preserve">    </w:t>
-      </w:r>
-      <w:proofErr w:type="spellStart"/>
-      <w:r>
-        <w:t>perhour_salary</w:t>
-      </w:r>
-      <w:proofErr w:type="spellEnd"/>
-      <w:r>
-        <w:t xml:space="preserve"> NUMERIC,</w:t>
-      </w:r>
-    </w:p>
-    <w:p>
-      <w:pPr>
-        <w:pStyle w:val="NoSpacing"/>
-      </w:pPr>
-      <w:r>
-        <w:t xml:space="preserve">    </w:t>
-      </w:r>
-      <w:proofErr w:type="spellStart"/>
-      <w:r>
-        <w:t>total_payable_amount</w:t>
-      </w:r>
-      <w:proofErr w:type="spellEnd"/>
-      <w:r>
-        <w:t xml:space="preserve"> NUMERIC</w:t>
+        <w:t xml:space="preserve">    salary NUMBER</w:t>
       </w:r>
     </w:p>
     <w:p>
@@ -1106,9 +1001,9 @@
           <w:lang w:val="en-US"/>
         </w:rPr>
         <w:drawing>
-          <wp:inline distT="0" distB="0" distL="0" distR="0" wp14:anchorId="3E790EB7" wp14:editId="501A660D">
-            <wp:extent cx="3609191" cy="1394460"/>
-            <wp:effectExtent l="0" t="0" r="0" b="0"/>
+          <wp:inline distT="0" distB="0" distL="0" distR="0" wp14:anchorId="27D1B840" wp14:editId="3EC1D941">
+            <wp:extent cx="4267200" cy="2016217"/>
+            <wp:effectExtent l="0" t="0" r="0" b="3175"/>
             <wp:docPr id="1" name="Picture 1"/>
             <wp:cNvGraphicFramePr>
               <a:graphicFrameLocks xmlns:a="http://schemas.openxmlformats.org/drawingml/2006/main" noChangeAspect="1"/>
@@ -1117,7 +1012,7 @@
               <a:graphicData uri="http://schemas.openxmlformats.org/drawingml/2006/picture">
                 <pic:pic xmlns:pic="http://schemas.openxmlformats.org/drawingml/2006/picture">
                   <pic:nvPicPr>
-                    <pic:cNvPr id="1" name="Screenshot (499).png"/>
+                    <pic:cNvPr id="1" name="Screenshot (532).png"/>
                     <pic:cNvPicPr/>
                   </pic:nvPicPr>
                   <pic:blipFill rotWithShape="1">
@@ -1128,13 +1023,13 @@
                         </a:ext>
                       </a:extLst>
                     </a:blip>
-                    <a:srcRect l="15128" t="66325" r="62308" b="18177"/>
+                    <a:srcRect l="20513" t="54245" r="39872" b="12478"/>
                     <a:stretch/>
                   </pic:blipFill>
                   <pic:spPr bwMode="auto">
                     <a:xfrm>
                       <a:off x="0" y="0"/>
-                      <a:ext cx="3714172" cy="1435021"/>
+                      <a:ext cx="4284299" cy="2024296"/>
                     </a:xfrm>
                     <a:prstGeom prst="rect">
                       <a:avLst/>
@@ -1185,150 +1080,36 @@
         <w:pStyle w:val="NoSpacing"/>
       </w:pPr>
       <w:r>
-        <w:t>CREATE OR REPLACE FUNCTION CALCULATE_</w:t>
-      </w:r>
-      <w:proofErr w:type="gramStart"/>
-      <w:r>
-        <w:t>AMOUNT(</w:t>
-      </w:r>
-      <w:proofErr w:type="gramEnd"/>
-      <w:r>
-        <w:t>)</w:t>
-      </w:r>
-    </w:p>
-    <w:p>
-      <w:pPr>
-        <w:pStyle w:val="NoSpacing"/>
-      </w:pPr>
-      <w:r>
-        <w:t>RETURNS TRIGGER</w:t>
-      </w:r>
-    </w:p>
-    <w:p>
-      <w:pPr>
-        <w:pStyle w:val="NoSpacing"/>
-      </w:pPr>
-      <w:r>
-        <w:t>AS</w:t>
-      </w:r>
-    </w:p>
-    <w:p>
-      <w:pPr>
-        <w:pStyle w:val="NoSpacing"/>
-      </w:pPr>
-      <w:r>
-        <w:t>$$</w:t>
-      </w:r>
-    </w:p>
-    <w:p>
-      <w:pPr>
-        <w:pStyle w:val="NoSpacing"/>
-      </w:pPr>
-      <w:r>
-        <w:t>BEGIN</w:t>
-      </w:r>
-    </w:p>
-    <w:p>
-      <w:pPr>
-        <w:pStyle w:val="NoSpacing"/>
-      </w:pPr>
-      <w:r>
-        <w:tab/>
-      </w:r>
-      <w:proofErr w:type="spellStart"/>
-      <w:r>
-        <w:t>NEW.total_payable_amount</w:t>
-      </w:r>
-      <w:proofErr w:type="spellEnd"/>
-      <w:r>
-        <w:t>=</w:t>
-      </w:r>
-      <w:proofErr w:type="spellStart"/>
-      <w:r>
-        <w:t>NEW.perhour_salary</w:t>
-      </w:r>
-      <w:proofErr w:type="spellEnd"/>
-      <w:r>
-        <w:t>*</w:t>
-      </w:r>
-      <w:proofErr w:type="spellStart"/>
-      <w:r>
-        <w:t>NEW.working_hours</w:t>
-      </w:r>
-      <w:proofErr w:type="spellEnd"/>
-      <w:r>
-        <w:t>;</w:t>
-      </w:r>
-    </w:p>
-    <w:p>
-      <w:pPr>
-        <w:pStyle w:val="NoSpacing"/>
-      </w:pPr>
-      <w:r>
-        <w:tab/>
-        <w:t xml:space="preserve">IF </w:t>
-      </w:r>
-      <w:proofErr w:type="spellStart"/>
-      <w:r>
-        <w:t>NEW.total_payable_amount</w:t>
-      </w:r>
-      <w:proofErr w:type="spellEnd"/>
-      <w:r>
-        <w:t>&gt;25000 THEN</w:t>
-      </w:r>
-    </w:p>
-    <w:p>
-      <w:pPr>
-        <w:pStyle w:val="NoSpacing"/>
-      </w:pPr>
-      <w:r>
-        <w:tab/>
-      </w:r>
-      <w:r>
-        <w:tab/>
-        <w:t>RAISE EXCEPTION 'AMOUNT IS GREATER THAN 25000';</w:t>
-      </w:r>
-    </w:p>
-    <w:p>
-      <w:pPr>
-        <w:pStyle w:val="NoSpacing"/>
-      </w:pPr>
-      <w:r>
-        <w:tab/>
-        <w:t>END IF;</w:t>
-      </w:r>
-    </w:p>
-    <w:p>
-      <w:pPr>
-        <w:pStyle w:val="NoSpacing"/>
-      </w:pPr>
-      <w:r>
-        <w:tab/>
-        <w:t>RETURN NEW;</w:t>
-      </w:r>
-    </w:p>
-    <w:p>
-      <w:pPr>
-        <w:pStyle w:val="NoSpacing"/>
-      </w:pPr>
-      <w:r>
-        <w:t>END;</w:t>
-      </w:r>
-    </w:p>
-    <w:p>
-      <w:pPr>
-        <w:pStyle w:val="NoSpacing"/>
-      </w:pPr>
-      <w:r>
-        <w:t>$$</w:t>
-      </w:r>
-    </w:p>
-    <w:p>
-      <w:pPr>
-        <w:pStyle w:val="NoSpacing"/>
-      </w:pPr>
-      <w:r>
-        <w:t>LANGUAGE PLPGSQL;</w:t>
+        <w:t>INSERT INTO employees VALUES (1, 'Amit', 30000);</w:t>
+      </w:r>
+    </w:p>
+    <w:p>
+      <w:pPr>
+        <w:pStyle w:val="NoSpacing"/>
+      </w:pPr>
+      <w:r>
+        <w:t>INSERT INTO employees VALUES (2, 'Riya', 40000);</w:t>
+      </w:r>
+    </w:p>
+    <w:p>
+      <w:pPr>
+        <w:pStyle w:val="NoSpacing"/>
+      </w:pPr>
+      <w:r>
+        <w:t>INSERT INTO employees VALUES (3, 'John', 50000);</w:t>
+      </w:r>
+    </w:p>
+    <w:p>
+      <w:pPr>
+        <w:pStyle w:val="NoSpacing"/>
+      </w:pPr>
+    </w:p>
+    <w:p>
+      <w:pPr>
+        <w:pStyle w:val="NoSpacing"/>
+      </w:pPr>
+      <w:r>
+        <w:t>COMMIT;</w:t>
       </w:r>
     </w:p>
     <w:p>
@@ -1351,17 +1132,23 @@
     <w:p>
       <w:pPr>
         <w:pStyle w:val="NoSpacing"/>
-      </w:pPr>
-      <w:r>
-        <w:rPr>
+        <w:rPr>
+          <w:b/>
+          <w:bCs/>
+        </w:rPr>
+      </w:pPr>
+      <w:r>
+        <w:rPr>
+          <w:b/>
+          <w:bCs/>
           <w:noProof/>
           <w:lang w:val="en-US"/>
         </w:rPr>
         <w:drawing>
-          <wp:inline distT="0" distB="0" distL="0" distR="0" wp14:anchorId="07DCB593" wp14:editId="60B152B8">
-            <wp:extent cx="4288538" cy="1386840"/>
-            <wp:effectExtent l="0" t="0" r="0" b="3810"/>
-            <wp:docPr id="6" name="Picture 6"/>
+          <wp:inline distT="0" distB="0" distL="0" distR="0" wp14:anchorId="6DC34C35" wp14:editId="78742C9B">
+            <wp:extent cx="3509682" cy="2940374"/>
+            <wp:effectExtent l="0" t="0" r="0" b="0"/>
+            <wp:docPr id="3" name="Picture 3"/>
             <wp:cNvGraphicFramePr>
               <a:graphicFrameLocks xmlns:a="http://schemas.openxmlformats.org/drawingml/2006/main" noChangeAspect="1"/>
             </wp:cNvGraphicFramePr>
@@ -1369,7 +1156,7 @@
               <a:graphicData uri="http://schemas.openxmlformats.org/drawingml/2006/picture">
                 <pic:pic xmlns:pic="http://schemas.openxmlformats.org/drawingml/2006/picture">
                   <pic:nvPicPr>
-                    <pic:cNvPr id="6" name="Screenshot (500).png"/>
+                    <pic:cNvPr id="3" name="Screenshot (533).png"/>
                     <pic:cNvPicPr/>
                   </pic:nvPicPr>
                   <pic:blipFill rotWithShape="1">
@@ -1380,13 +1167,13 @@
                         </a:ext>
                       </a:extLst>
                     </a:blip>
-                    <a:srcRect l="15385" t="66097" r="58846" b="19089"/>
+                    <a:srcRect l="20442" t="34724" r="41460" b="8532"/>
                     <a:stretch/>
                   </pic:blipFill>
                   <pic:spPr bwMode="auto">
                     <a:xfrm>
                       <a:off x="0" y="0"/>
-                      <a:ext cx="4335265" cy="1401951"/>
+                      <a:ext cx="3515985" cy="2945655"/>
                     </a:xfrm>
                     <a:prstGeom prst="rect">
                       <a:avLst/>
@@ -1419,94 +1206,15 @@
         <w:rPr>
           <w:b/>
           <w:bCs/>
-        </w:rPr>
-        <w:lastRenderedPageBreak/>
-        <w:t>SQL Input Queries</w:t>
-      </w:r>
-    </w:p>
-    <w:p>
-      <w:pPr>
-        <w:pStyle w:val="NoSpacing"/>
-      </w:pPr>
-      <w:r>
-        <w:t>CREATE OR REPLACE TRIGGER CAL_PAYABLE_AMOUNT</w:t>
-      </w:r>
-    </w:p>
-    <w:p>
-      <w:pPr>
-        <w:pStyle w:val="NoSpacing"/>
-      </w:pPr>
-      <w:r>
-        <w:t>BEFORE INSERT</w:t>
-      </w:r>
-    </w:p>
-    <w:p>
-      <w:pPr>
-        <w:pStyle w:val="NoSpacing"/>
-      </w:pPr>
-      <w:r>
-        <w:t>ON EMPLOYEE</w:t>
-      </w:r>
-    </w:p>
-    <w:p>
-      <w:pPr>
-        <w:pStyle w:val="NoSpacing"/>
-      </w:pPr>
-      <w:r>
-        <w:t>FOR EACH ROW</w:t>
-      </w:r>
-    </w:p>
-    <w:p>
-      <w:pPr>
-        <w:pStyle w:val="NoSpacing"/>
-      </w:pPr>
-      <w:r>
-        <w:t>EXECUTE FUNCTION CALCULATE_</w:t>
-      </w:r>
-      <w:proofErr w:type="gramStart"/>
-      <w:r>
-        <w:t>AMOUNT(</w:t>
-      </w:r>
-      <w:proofErr w:type="gramEnd"/>
-      <w:r>
-        <w:t>);</w:t>
-      </w:r>
-    </w:p>
-    <w:p>
-      <w:pPr>
-        <w:pStyle w:val="NoSpacing"/>
-      </w:pPr>
-    </w:p>
-    <w:p>
-      <w:pPr>
-        <w:pStyle w:val="NoSpacing"/>
-        <w:rPr>
-          <w:b/>
-          <w:bCs/>
-        </w:rPr>
-      </w:pPr>
-      <w:r>
-        <w:rPr>
-          <w:b/>
-          <w:bCs/>
-        </w:rPr>
-        <w:t>Output</w:t>
-      </w:r>
-    </w:p>
-    <w:p>
-      <w:pPr>
-        <w:pStyle w:val="NoSpacing"/>
-      </w:pPr>
-      <w:r>
-        <w:rPr>
           <w:noProof/>
           <w:lang w:val="en-US"/>
         </w:rPr>
+        <w:lastRenderedPageBreak/>
         <w:drawing>
-          <wp:inline distT="0" distB="0" distL="0" distR="0" wp14:anchorId="14648A55" wp14:editId="03AC3674">
-            <wp:extent cx="3821799" cy="1402080"/>
-            <wp:effectExtent l="0" t="0" r="7620" b="7620"/>
-            <wp:docPr id="7" name="Picture 7"/>
+          <wp:inline distT="0" distB="0" distL="0" distR="0" wp14:anchorId="2024B3D3" wp14:editId="344B23A0">
+            <wp:extent cx="3822700" cy="855558"/>
+            <wp:effectExtent l="0" t="0" r="6350" b="1905"/>
+            <wp:docPr id="4" name="Picture 4"/>
             <wp:cNvGraphicFramePr>
               <a:graphicFrameLocks xmlns:a="http://schemas.openxmlformats.org/drawingml/2006/main" noChangeAspect="1"/>
             </wp:cNvGraphicFramePr>
@@ -1514,7 +1222,7 @@
               <a:graphicData uri="http://schemas.openxmlformats.org/drawingml/2006/picture">
                 <pic:pic xmlns:pic="http://schemas.openxmlformats.org/drawingml/2006/picture">
                   <pic:nvPicPr>
-                    <pic:cNvPr id="7" name="Screenshot (501).png"/>
+                    <pic:cNvPr id="4" name="Screenshot (534).png"/>
                     <pic:cNvPicPr/>
                   </pic:nvPicPr>
                   <pic:blipFill rotWithShape="1">
@@ -1525,13 +1233,13 @@
                         </a:ext>
                       </a:extLst>
                     </a:blip>
-                    <a:srcRect l="15641" t="66325" r="62693" b="19544"/>
+                    <a:srcRect l="20363" t="75080" r="38832" b="8684"/>
                     <a:stretch/>
                   </pic:blipFill>
                   <pic:spPr bwMode="auto">
                     <a:xfrm>
                       <a:off x="0" y="0"/>
-                      <a:ext cx="3846541" cy="1411157"/>
+                      <a:ext cx="3868764" cy="865868"/>
                     </a:xfrm>
                     <a:prstGeom prst="rect">
                       <a:avLst/>
@@ -1555,138 +1263,19 @@
     <w:p>
       <w:pPr>
         <w:pStyle w:val="NoSpacing"/>
-      </w:pPr>
-    </w:p>
-    <w:p>
-      <w:pPr>
-        <w:pStyle w:val="NoSpacing"/>
         <w:rPr>
           <w:b/>
           <w:bCs/>
         </w:rPr>
       </w:pPr>
-      <w:r>
+    </w:p>
+    <w:p>
+      <w:pPr>
+        <w:pStyle w:val="NoSpacing"/>
         <w:rPr>
           <w:b/>
           <w:bCs/>
         </w:rPr>
-        <w:t>SQL Input Queries</w:t>
-      </w:r>
-    </w:p>
-    <w:p>
-      <w:pPr>
-        <w:pStyle w:val="NoSpacing"/>
-      </w:pPr>
-      <w:r>
-        <w:t>DO</w:t>
-      </w:r>
-    </w:p>
-    <w:p>
-      <w:pPr>
-        <w:pStyle w:val="NoSpacing"/>
-      </w:pPr>
-      <w:r>
-        <w:t>$$</w:t>
-      </w:r>
-    </w:p>
-    <w:p>
-      <w:pPr>
-        <w:pStyle w:val="NoSpacing"/>
-      </w:pPr>
-      <w:r>
-        <w:t>BEGIN</w:t>
-      </w:r>
-    </w:p>
-    <w:p>
-      <w:pPr>
-        <w:pStyle w:val="NoSpacing"/>
-      </w:pPr>
-      <w:r>
-        <w:tab/>
-        <w:t xml:space="preserve">INSERT INTO </w:t>
-      </w:r>
-      <w:proofErr w:type="gramStart"/>
-      <w:r>
-        <w:t>EMPLOYEE(</w:t>
-      </w:r>
-      <w:proofErr w:type="gramEnd"/>
-      <w:r>
-        <w:t>EMP_ID, EMP_NAME, WORKING_HOURS, PERHOUR_SALARY) VALUES</w:t>
-      </w:r>
-    </w:p>
-    <w:p>
-      <w:pPr>
-        <w:pStyle w:val="NoSpacing"/>
-      </w:pPr>
-      <w:r>
-        <w:tab/>
-        <w:t>(1, 'AKASH', 10, 250);</w:t>
-      </w:r>
-    </w:p>
-    <w:p>
-      <w:pPr>
-        <w:pStyle w:val="NoSpacing"/>
-      </w:pPr>
-    </w:p>
-    <w:p>
-      <w:pPr>
-        <w:pStyle w:val="NoSpacing"/>
-      </w:pPr>
-      <w:r>
-        <w:tab/>
-        <w:t>EXCEPTION</w:t>
-      </w:r>
-    </w:p>
-    <w:p>
-      <w:pPr>
-        <w:pStyle w:val="NoSpacing"/>
-      </w:pPr>
-      <w:r>
-        <w:tab/>
-        <w:t>WHEN OTHERS THEN</w:t>
-      </w:r>
-    </w:p>
-    <w:p>
-      <w:pPr>
-        <w:pStyle w:val="NoSpacing"/>
-      </w:pPr>
-      <w:r>
-        <w:tab/>
-        <w:t>RAISE NOTICE '%', SQLERRM;</w:t>
-      </w:r>
-    </w:p>
-    <w:p>
-      <w:pPr>
-        <w:pStyle w:val="NoSpacing"/>
-      </w:pPr>
-      <w:r>
-        <w:t>END;</w:t>
-      </w:r>
-    </w:p>
-    <w:p>
-      <w:pPr>
-        <w:pStyle w:val="NoSpacing"/>
-      </w:pPr>
-      <w:r>
-        <w:t>$$;</w:t>
-      </w:r>
-    </w:p>
-    <w:p>
-      <w:pPr>
-        <w:pStyle w:val="NoSpacing"/>
-      </w:pPr>
-    </w:p>
-    <w:p>
-      <w:pPr>
-        <w:pStyle w:val="NoSpacing"/>
-      </w:pPr>
-      <w:r>
-        <w:t>SELECT * FROM EMPLOYEE;</w:t>
-      </w:r>
-    </w:p>
-    <w:p>
-      <w:pPr>
-        <w:pStyle w:val="NoSpacing"/>
       </w:pPr>
     </w:p>
     <w:p>
@@ -1702,6 +1291,88 @@
           <w:b/>
           <w:bCs/>
         </w:rPr>
+        <w:t>SQL Input Queries</w:t>
+      </w:r>
+    </w:p>
+    <w:p>
+      <w:pPr>
+        <w:pStyle w:val="NoSpacing"/>
+      </w:pPr>
+      <w:r>
+        <w:t>CREATE OR REPLACE PACKAGE emp_package AS</w:t>
+      </w:r>
+    </w:p>
+    <w:p>
+      <w:pPr>
+        <w:pStyle w:val="NoSpacing"/>
+      </w:pPr>
+      <w:r>
+        <w:t xml:space="preserve">    -- Procedure to display all employee details</w:t>
+      </w:r>
+    </w:p>
+    <w:p>
+      <w:pPr>
+        <w:pStyle w:val="NoSpacing"/>
+      </w:pPr>
+      <w:r>
+        <w:t xml:space="preserve">    PROCEDURE show_employees;</w:t>
+      </w:r>
+    </w:p>
+    <w:p>
+      <w:pPr>
+        <w:pStyle w:val="NoSpacing"/>
+      </w:pPr>
+    </w:p>
+    <w:p>
+      <w:pPr>
+        <w:pStyle w:val="NoSpacing"/>
+      </w:pPr>
+      <w:r>
+        <w:t xml:space="preserve">    -- Procedure to display employee by ID</w:t>
+      </w:r>
+    </w:p>
+    <w:p>
+      <w:pPr>
+        <w:pStyle w:val="NoSpacing"/>
+      </w:pPr>
+      <w:r>
+        <w:t xml:space="preserve">    PROCEDURE get_employee(p_id NUMBER);</w:t>
+      </w:r>
+    </w:p>
+    <w:p>
+      <w:pPr>
+        <w:pStyle w:val="NoSpacing"/>
+      </w:pPr>
+      <w:r>
+        <w:t>END emp_package;</w:t>
+      </w:r>
+    </w:p>
+    <w:p>
+      <w:pPr>
+        <w:pStyle w:val="NoSpacing"/>
+      </w:pPr>
+      <w:r>
+        <w:t>/</w:t>
+      </w:r>
+    </w:p>
+    <w:p>
+      <w:pPr>
+        <w:pStyle w:val="NoSpacing"/>
+      </w:pPr>
+    </w:p>
+    <w:p>
+      <w:pPr>
+        <w:pStyle w:val="NoSpacing"/>
+        <w:rPr>
+          <w:b/>
+          <w:bCs/>
+        </w:rPr>
+      </w:pPr>
+      <w:r>
+        <w:rPr>
+          <w:b/>
+          <w:bCs/>
+        </w:rPr>
         <w:t>Output</w:t>
       </w:r>
     </w:p>
@@ -1715,10 +1386,10 @@
           <w:lang w:val="en-US"/>
         </w:rPr>
         <w:drawing>
-          <wp:inline distT="0" distB="0" distL="0" distR="0" wp14:anchorId="31C34A1B" wp14:editId="74455433">
-            <wp:extent cx="3113460" cy="1066800"/>
-            <wp:effectExtent l="0" t="0" r="0" b="0"/>
-            <wp:docPr id="8" name="Picture 8"/>
+          <wp:inline distT="0" distB="0" distL="0" distR="0" wp14:anchorId="7C0C9AF1" wp14:editId="61B506FA">
+            <wp:extent cx="3679371" cy="1539632"/>
+            <wp:effectExtent l="0" t="0" r="0" b="3810"/>
+            <wp:docPr id="6" name="Picture 6"/>
             <wp:cNvGraphicFramePr>
               <a:graphicFrameLocks xmlns:a="http://schemas.openxmlformats.org/drawingml/2006/main" noChangeAspect="1"/>
             </wp:cNvGraphicFramePr>
@@ -1726,7 +1397,7 @@
               <a:graphicData uri="http://schemas.openxmlformats.org/drawingml/2006/picture">
                 <pic:pic xmlns:pic="http://schemas.openxmlformats.org/drawingml/2006/picture">
                   <pic:nvPicPr>
-                    <pic:cNvPr id="8" name="Screenshot (502).png"/>
+                    <pic:cNvPr id="6" name="Screenshot (535).png"/>
                     <pic:cNvPicPr/>
                   </pic:nvPicPr>
                   <pic:blipFill rotWithShape="1">
@@ -1737,13 +1408,13 @@
                         </a:ext>
                       </a:extLst>
                     </a:blip>
-                    <a:srcRect l="15466" t="66393" r="63271" b="20655"/>
+                    <a:srcRect l="20421" t="62678" r="41481" b="8980"/>
                     <a:stretch/>
                   </pic:blipFill>
                   <pic:spPr bwMode="auto">
                     <a:xfrm>
                       <a:off x="0" y="0"/>
-                      <a:ext cx="3174063" cy="1087565"/>
+                      <a:ext cx="3700500" cy="1548473"/>
                     </a:xfrm>
                     <a:prstGeom prst="rect">
                       <a:avLst/>
@@ -1767,19 +1438,248 @@
     <w:p>
       <w:pPr>
         <w:pStyle w:val="NoSpacing"/>
+      </w:pPr>
+    </w:p>
+    <w:p>
+      <w:pPr>
+        <w:pStyle w:val="NoSpacing"/>
         <w:rPr>
           <w:b/>
           <w:bCs/>
         </w:rPr>
       </w:pPr>
-    </w:p>
-    <w:p>
-      <w:pPr>
-        <w:pStyle w:val="NoSpacing"/>
+      <w:r>
         <w:rPr>
           <w:b/>
           <w:bCs/>
         </w:rPr>
+        <w:t>SQL Input Queries</w:t>
+      </w:r>
+    </w:p>
+    <w:p>
+      <w:pPr>
+        <w:pStyle w:val="NoSpacing"/>
+      </w:pPr>
+      <w:r>
+        <w:t>CREATE OR REPLACE PACKAGE BODY emp_package AS</w:t>
+      </w:r>
+    </w:p>
+    <w:p>
+      <w:pPr>
+        <w:pStyle w:val="NoSpacing"/>
+      </w:pPr>
+    </w:p>
+    <w:p>
+      <w:pPr>
+        <w:pStyle w:val="NoSpacing"/>
+      </w:pPr>
+      <w:r>
+        <w:t xml:space="preserve">    CURSOR emp_cursor IS</w:t>
+      </w:r>
+    </w:p>
+    <w:p>
+      <w:pPr>
+        <w:pStyle w:val="NoSpacing"/>
+      </w:pPr>
+      <w:r>
+        <w:t xml:space="preserve">        SELECT emp_id, emp_name, salary FROM employees;</w:t>
+      </w:r>
+    </w:p>
+    <w:p>
+      <w:pPr>
+        <w:pStyle w:val="NoSpacing"/>
+      </w:pPr>
+    </w:p>
+    <w:p>
+      <w:pPr>
+        <w:pStyle w:val="NoSpacing"/>
+      </w:pPr>
+      <w:r>
+        <w:t xml:space="preserve"> </w:t>
+      </w:r>
+    </w:p>
+    <w:p>
+      <w:pPr>
+        <w:pStyle w:val="NoSpacing"/>
+      </w:pPr>
+      <w:r>
+        <w:t xml:space="preserve">    PROCEDURE show_employees IS</w:t>
+      </w:r>
+    </w:p>
+    <w:p>
+      <w:pPr>
+        <w:pStyle w:val="NoSpacing"/>
+      </w:pPr>
+      <w:r>
+        <w:t xml:space="preserve">    BEGIN</w:t>
+      </w:r>
+    </w:p>
+    <w:p>
+      <w:pPr>
+        <w:pStyle w:val="NoSpacing"/>
+      </w:pPr>
+      <w:r>
+        <w:t xml:space="preserve">        FOR rec IN emp_cursor LOOP</w:t>
+      </w:r>
+    </w:p>
+    <w:p>
+      <w:pPr>
+        <w:pStyle w:val="NoSpacing"/>
+      </w:pPr>
+      <w:r>
+        <w:t xml:space="preserve">            DBMS_OUTPUT.PUT_LINE('ID: ' || rec.emp_id ||</w:t>
+      </w:r>
+    </w:p>
+    <w:p>
+      <w:pPr>
+        <w:pStyle w:val="NoSpacing"/>
+      </w:pPr>
+      <w:r>
+        <w:t xml:space="preserve">                                 ' Name: ' || rec.emp_name ||</w:t>
+      </w:r>
+    </w:p>
+    <w:p>
+      <w:pPr>
+        <w:pStyle w:val="NoSpacing"/>
+      </w:pPr>
+      <w:r>
+        <w:t xml:space="preserve">                                 ' Salary: ' || rec.salary);</w:t>
+      </w:r>
+    </w:p>
+    <w:p>
+      <w:pPr>
+        <w:pStyle w:val="NoSpacing"/>
+      </w:pPr>
+      <w:r>
+        <w:t xml:space="preserve">        END LOOP;</w:t>
+      </w:r>
+    </w:p>
+    <w:p>
+      <w:pPr>
+        <w:pStyle w:val="NoSpacing"/>
+      </w:pPr>
+      <w:r>
+        <w:lastRenderedPageBreak/>
+        <w:t xml:space="preserve">    END;</w:t>
+      </w:r>
+    </w:p>
+    <w:p>
+      <w:pPr>
+        <w:pStyle w:val="NoSpacing"/>
+      </w:pPr>
+    </w:p>
+    <w:p>
+      <w:pPr>
+        <w:pStyle w:val="NoSpacing"/>
+      </w:pPr>
+      <w:r>
+        <w:t xml:space="preserve"> </w:t>
+      </w:r>
+    </w:p>
+    <w:p>
+      <w:pPr>
+        <w:pStyle w:val="NoSpacing"/>
+      </w:pPr>
+      <w:r>
+        <w:t xml:space="preserve">    PROCEDURE get_employee(p_id NUMBER) IS</w:t>
+      </w:r>
+    </w:p>
+    <w:p>
+      <w:pPr>
+        <w:pStyle w:val="NoSpacing"/>
+      </w:pPr>
+      <w:r>
+        <w:t xml:space="preserve">    BEGIN</w:t>
+      </w:r>
+    </w:p>
+    <w:p>
+      <w:pPr>
+        <w:pStyle w:val="NoSpacing"/>
+      </w:pPr>
+      <w:r>
+        <w:t xml:space="preserve">        FOR rec IN emp_cursor LOOP</w:t>
+      </w:r>
+    </w:p>
+    <w:p>
+      <w:pPr>
+        <w:pStyle w:val="NoSpacing"/>
+      </w:pPr>
+      <w:r>
+        <w:t xml:space="preserve">            IF rec.emp_id = p_id THEN</w:t>
+      </w:r>
+    </w:p>
+    <w:p>
+      <w:pPr>
+        <w:pStyle w:val="NoSpacing"/>
+      </w:pPr>
+      <w:r>
+        <w:t xml:space="preserve">                DBMS_OUTPUT.PUT_LINE('Employee Found -&gt; ID: ' || rec.emp_id ||</w:t>
+      </w:r>
+    </w:p>
+    <w:p>
+      <w:pPr>
+        <w:pStyle w:val="NoSpacing"/>
+      </w:pPr>
+      <w:r>
+        <w:t xml:space="preserve">                                     ' Name: ' || rec.emp_name ||</w:t>
+      </w:r>
+    </w:p>
+    <w:p>
+      <w:pPr>
+        <w:pStyle w:val="NoSpacing"/>
+      </w:pPr>
+      <w:r>
+        <w:t xml:space="preserve">                                     ' Salary: ' || rec.salary);</w:t>
+      </w:r>
+    </w:p>
+    <w:p>
+      <w:pPr>
+        <w:pStyle w:val="NoSpacing"/>
+      </w:pPr>
+      <w:r>
+        <w:t xml:space="preserve">            END IF;</w:t>
+      </w:r>
+    </w:p>
+    <w:p>
+      <w:pPr>
+        <w:pStyle w:val="NoSpacing"/>
+      </w:pPr>
+      <w:r>
+        <w:t xml:space="preserve">        END LOOP;</w:t>
+      </w:r>
+    </w:p>
+    <w:p>
+      <w:pPr>
+        <w:pStyle w:val="NoSpacing"/>
+      </w:pPr>
+      <w:r>
+        <w:t xml:space="preserve">    END;</w:t>
+      </w:r>
+    </w:p>
+    <w:p>
+      <w:pPr>
+        <w:pStyle w:val="NoSpacing"/>
+      </w:pPr>
+    </w:p>
+    <w:p>
+      <w:pPr>
+        <w:pStyle w:val="NoSpacing"/>
+      </w:pPr>
+      <w:r>
+        <w:t>END emp_package;</w:t>
+      </w:r>
+    </w:p>
+    <w:p>
+      <w:pPr>
+        <w:pStyle w:val="NoSpacing"/>
+      </w:pPr>
+      <w:r>
+        <w:t>/</w:t>
+      </w:r>
+    </w:p>
+    <w:p>
+      <w:pPr>
+        <w:pStyle w:val="NoSpacing"/>
       </w:pPr>
     </w:p>
     <w:p>
@@ -1792,15 +1692,26 @@
       </w:pPr>
       <w:r>
         <w:rPr>
+          <w:b/>
+          <w:bCs/>
+        </w:rPr>
+        <w:t>Output</w:t>
+      </w:r>
+    </w:p>
+    <w:p>
+      <w:pPr>
+        <w:pStyle w:val="NoSpacing"/>
+      </w:pPr>
+      <w:r>
+        <w:rPr>
           <w:noProof/>
           <w:lang w:val="en-US"/>
         </w:rPr>
-        <w:lastRenderedPageBreak/>
         <w:drawing>
-          <wp:inline distT="0" distB="0" distL="0" distR="0" wp14:anchorId="3014CDF2" wp14:editId="022AADE0">
-            <wp:extent cx="5140880" cy="1108364"/>
-            <wp:effectExtent l="0" t="0" r="3175" b="0"/>
-            <wp:docPr id="9" name="Picture 9"/>
+          <wp:inline distT="0" distB="0" distL="0" distR="0" wp14:anchorId="183F61C2" wp14:editId="799D6EDC">
+            <wp:extent cx="4229100" cy="1581963"/>
+            <wp:effectExtent l="0" t="0" r="0" b="0"/>
+            <wp:docPr id="7" name="Picture 7"/>
             <wp:cNvGraphicFramePr>
               <a:graphicFrameLocks xmlns:a="http://schemas.openxmlformats.org/drawingml/2006/main" noChangeAspect="1"/>
             </wp:cNvGraphicFramePr>
@@ -1808,7 +1719,7 @@
               <a:graphicData uri="http://schemas.openxmlformats.org/drawingml/2006/picture">
                 <pic:pic xmlns:pic="http://schemas.openxmlformats.org/drawingml/2006/picture">
                   <pic:nvPicPr>
-                    <pic:cNvPr id="9" name="Screenshot (503).png"/>
+                    <pic:cNvPr id="7" name="Screenshot (536).png"/>
                     <pic:cNvPicPr/>
                   </pic:nvPicPr>
                   <pic:blipFill rotWithShape="1">
@@ -1819,13 +1730,13 @@
                         </a:ext>
                       </a:extLst>
                     </a:blip>
-                    <a:srcRect l="15465" t="66667" r="40843" b="16586"/>
+                    <a:srcRect l="20609" t="62841" r="37988" b="9626"/>
                     <a:stretch/>
                   </pic:blipFill>
                   <pic:spPr bwMode="auto">
                     <a:xfrm>
                       <a:off x="0" y="0"/>
-                      <a:ext cx="5226924" cy="1126915"/>
+                      <a:ext cx="4250772" cy="1590070"/>
                     </a:xfrm>
                     <a:prstGeom prst="rect">
                       <a:avLst/>
@@ -1863,128 +1774,14 @@
           <w:bCs/>
         </w:rPr>
       </w:pPr>
-      <w:r>
+    </w:p>
+    <w:p>
+      <w:pPr>
+        <w:pStyle w:val="NoSpacing"/>
         <w:rPr>
           <w:b/>
           <w:bCs/>
         </w:rPr>
-        <w:t>SQL Input Queries</w:t>
-      </w:r>
-    </w:p>
-    <w:p>
-      <w:pPr>
-        <w:pStyle w:val="NoSpacing"/>
-      </w:pPr>
-      <w:r>
-        <w:t>DO</w:t>
-      </w:r>
-    </w:p>
-    <w:p>
-      <w:pPr>
-        <w:pStyle w:val="NoSpacing"/>
-      </w:pPr>
-      <w:r>
-        <w:t>$$</w:t>
-      </w:r>
-    </w:p>
-    <w:p>
-      <w:pPr>
-        <w:pStyle w:val="NoSpacing"/>
-      </w:pPr>
-      <w:r>
-        <w:t>BEGIN</w:t>
-      </w:r>
-    </w:p>
-    <w:p>
-      <w:pPr>
-        <w:pStyle w:val="NoSpacing"/>
-      </w:pPr>
-      <w:r>
-        <w:tab/>
-        <w:t xml:space="preserve">INSERT INTO </w:t>
-      </w:r>
-      <w:proofErr w:type="gramStart"/>
-      <w:r>
-        <w:t>EMPLOYEE(</w:t>
-      </w:r>
-      <w:proofErr w:type="gramEnd"/>
-      <w:r>
-        <w:t>EMP_ID, EMP_NAME, WORKING_HOURS, PERHOUR_SALARY) VALUES</w:t>
-      </w:r>
-    </w:p>
-    <w:p>
-      <w:pPr>
-        <w:pStyle w:val="NoSpacing"/>
-      </w:pPr>
-      <w:r>
-        <w:tab/>
-        <w:t>(1, 'AKASH', 10, 250000);</w:t>
-      </w:r>
-    </w:p>
-    <w:p>
-      <w:pPr>
-        <w:pStyle w:val="NoSpacing"/>
-      </w:pPr>
-    </w:p>
-    <w:p>
-      <w:pPr>
-        <w:pStyle w:val="NoSpacing"/>
-      </w:pPr>
-      <w:r>
-        <w:tab/>
-        <w:t>EXCEPTION</w:t>
-      </w:r>
-    </w:p>
-    <w:p>
-      <w:pPr>
-        <w:pStyle w:val="NoSpacing"/>
-      </w:pPr>
-      <w:r>
-        <w:tab/>
-        <w:t>WHEN OTHERS THEN</w:t>
-      </w:r>
-    </w:p>
-    <w:p>
-      <w:pPr>
-        <w:pStyle w:val="NoSpacing"/>
-      </w:pPr>
-      <w:r>
-        <w:tab/>
-        <w:t>RAISE NOTICE '%', SQLERRM;</w:t>
-      </w:r>
-    </w:p>
-    <w:p>
-      <w:pPr>
-        <w:pStyle w:val="NoSpacing"/>
-      </w:pPr>
-      <w:r>
-        <w:t>END;</w:t>
-      </w:r>
-    </w:p>
-    <w:p>
-      <w:pPr>
-        <w:pStyle w:val="NoSpacing"/>
-      </w:pPr>
-      <w:r>
-        <w:t>$$;</w:t>
-      </w:r>
-    </w:p>
-    <w:p>
-      <w:pPr>
-        <w:pStyle w:val="NoSpacing"/>
-      </w:pPr>
-    </w:p>
-    <w:p>
-      <w:pPr>
-        <w:pStyle w:val="NoSpacing"/>
-      </w:pPr>
-      <w:r>
-        <w:t>SELECT * FROM EMPLOYEE;</w:t>
-      </w:r>
-    </w:p>
-    <w:p>
-      <w:pPr>
-        <w:pStyle w:val="NoSpacing"/>
       </w:pPr>
     </w:p>
     <w:p>
@@ -2000,23 +1797,114 @@
           <w:b/>
           <w:bCs/>
         </w:rPr>
+        <w:t>SQL Input Queries</w:t>
+      </w:r>
+    </w:p>
+    <w:p>
+      <w:pPr>
+        <w:pStyle w:val="NoSpacing"/>
+      </w:pPr>
+      <w:r>
+        <w:t>SET SERVEROUTPUT ON;</w:t>
+      </w:r>
+    </w:p>
+    <w:p>
+      <w:pPr>
+        <w:pStyle w:val="NoSpacing"/>
+      </w:pPr>
+    </w:p>
+    <w:p>
+      <w:pPr>
+        <w:pStyle w:val="NoSpacing"/>
+      </w:pPr>
+    </w:p>
+    <w:p>
+      <w:pPr>
+        <w:pStyle w:val="NoSpacing"/>
+      </w:pPr>
+      <w:r>
+        <w:t>BEGIN</w:t>
+      </w:r>
+    </w:p>
+    <w:p>
+      <w:pPr>
+        <w:pStyle w:val="NoSpacing"/>
+      </w:pPr>
+      <w:r>
+        <w:t xml:space="preserve">    emp_package.show_employees;</w:t>
+      </w:r>
+    </w:p>
+    <w:p>
+      <w:pPr>
+        <w:pStyle w:val="NoSpacing"/>
+      </w:pPr>
+      <w:r>
+        <w:t>END;</w:t>
+      </w:r>
+    </w:p>
+    <w:p>
+      <w:pPr>
+        <w:pStyle w:val="NoSpacing"/>
+      </w:pPr>
+      <w:r>
+        <w:t>/</w:t>
+      </w:r>
+    </w:p>
+    <w:p>
+      <w:pPr>
+        <w:pStyle w:val="NoSpacing"/>
+      </w:pPr>
+      <w:r>
+        <w:t>CALL update_student(1, 'Rahul Verma', 22, 'Data Science');</w:t>
+      </w:r>
+    </w:p>
+    <w:p>
+      <w:pPr>
+        <w:pStyle w:val="NoSpacing"/>
+      </w:pPr>
+    </w:p>
+    <w:p>
+      <w:pPr>
+        <w:pStyle w:val="NoSpacing"/>
+      </w:pPr>
+    </w:p>
+    <w:p>
+      <w:pPr>
+        <w:pStyle w:val="NoSpacing"/>
+        <w:rPr>
+          <w:b/>
+          <w:bCs/>
+        </w:rPr>
+      </w:pPr>
+      <w:r>
+        <w:rPr>
+          <w:b/>
+          <w:bCs/>
+        </w:rPr>
+        <w:lastRenderedPageBreak/>
         <w:t>Output</w:t>
       </w:r>
     </w:p>
     <w:p>
       <w:pPr>
         <w:pStyle w:val="NoSpacing"/>
-      </w:pPr>
-      <w:r>
-        <w:rPr>
+        <w:rPr>
+          <w:b/>
+          <w:bCs/>
+        </w:rPr>
+      </w:pPr>
+      <w:r>
+        <w:rPr>
+          <w:b/>
+          <w:bCs/>
           <w:noProof/>
           <w:lang w:val="en-US"/>
         </w:rPr>
         <w:drawing>
-          <wp:inline distT="0" distB="0" distL="0" distR="0" wp14:anchorId="2A7C8A3A" wp14:editId="1F3DE8B5">
-            <wp:extent cx="3814640" cy="1378528"/>
-            <wp:effectExtent l="0" t="0" r="0" b="0"/>
-            <wp:docPr id="11" name="Picture 11"/>
+          <wp:inline distT="0" distB="0" distL="0" distR="0" wp14:anchorId="4DF35215" wp14:editId="03EDF24B">
+            <wp:extent cx="3846228" cy="1600200"/>
+            <wp:effectExtent l="0" t="0" r="1905" b="0"/>
+            <wp:docPr id="8" name="Picture 8"/>
             <wp:cNvGraphicFramePr>
               <a:graphicFrameLocks xmlns:a="http://schemas.openxmlformats.org/drawingml/2006/main" noChangeAspect="1"/>
             </wp:cNvGraphicFramePr>
@@ -2024,7 +1912,7 @@
               <a:graphicData uri="http://schemas.openxmlformats.org/drawingml/2006/picture">
                 <pic:pic xmlns:pic="http://schemas.openxmlformats.org/drawingml/2006/picture">
                   <pic:nvPicPr>
-                    <pic:cNvPr id="11" name="Screenshot (505).png"/>
+                    <pic:cNvPr id="8" name="Screenshot (537).png"/>
                     <pic:cNvPicPr/>
                   </pic:nvPicPr>
                   <pic:blipFill rotWithShape="1">
@@ -2035,13 +1923,13 @@
                         </a:ext>
                       </a:extLst>
                     </a:blip>
-                    <a:srcRect l="15275" t="65682" r="54392" b="14831"/>
+                    <a:srcRect l="20152" t="62515" r="41739" b="9298"/>
                     <a:stretch/>
                   </pic:blipFill>
                   <pic:spPr bwMode="auto">
                     <a:xfrm>
                       <a:off x="0" y="0"/>
-                      <a:ext cx="3883356" cy="1403360"/>
+                      <a:ext cx="3864993" cy="1608007"/>
                     </a:xfrm>
                     <a:prstGeom prst="rect">
                       <a:avLst/>
@@ -2066,24 +1954,101 @@
       <w:pPr>
         <w:pStyle w:val="NoSpacing"/>
       </w:pPr>
-      <w:r>
-        <w:rPr>
+    </w:p>
+    <w:p>
+      <w:pPr>
+        <w:pStyle w:val="NoSpacing"/>
+      </w:pPr>
+    </w:p>
+    <w:p>
+      <w:pPr>
+        <w:pStyle w:val="NoSpacing"/>
+        <w:rPr>
+          <w:b/>
+          <w:bCs/>
+        </w:rPr>
+      </w:pPr>
+      <w:r>
+        <w:rPr>
+          <w:b/>
+          <w:bCs/>
+        </w:rPr>
+        <w:t>SQL Input Queries</w:t>
+      </w:r>
+    </w:p>
+    <w:p>
+      <w:pPr>
+        <w:pStyle w:val="NoSpacing"/>
+      </w:pPr>
+      <w:r>
+        <w:t>BEGIN</w:t>
+      </w:r>
+    </w:p>
+    <w:p>
+      <w:pPr>
+        <w:pStyle w:val="NoSpacing"/>
+      </w:pPr>
+      <w:r>
+        <w:t xml:space="preserve">    emp_package.get_employee(2);</w:t>
+      </w:r>
+    </w:p>
+    <w:p>
+      <w:pPr>
+        <w:pStyle w:val="NoSpacing"/>
+      </w:pPr>
+      <w:r>
+        <w:t>END;</w:t>
+      </w:r>
+    </w:p>
+    <w:p>
+      <w:pPr>
+        <w:pStyle w:val="NoSpacing"/>
+      </w:pPr>
+      <w:r>
+        <w:t>/</w:t>
+      </w:r>
+    </w:p>
+    <w:p>
+      <w:pPr>
+        <w:pStyle w:val="NoSpacing"/>
+      </w:pPr>
+    </w:p>
+    <w:p>
+      <w:pPr>
+        <w:pStyle w:val="NoSpacing"/>
+        <w:rPr>
+          <w:b/>
+          <w:bCs/>
+        </w:rPr>
+      </w:pPr>
+      <w:r>
+        <w:rPr>
+          <w:b/>
+          <w:bCs/>
+        </w:rPr>
+        <w:t>Output</w:t>
+      </w:r>
+    </w:p>
+    <w:p>
+      <w:pPr>
+        <w:pStyle w:val="NoSpacing"/>
+        <w:rPr>
+          <w:b/>
+          <w:bCs/>
+        </w:rPr>
+      </w:pPr>
+      <w:r>
+        <w:rPr>
+          <w:b/>
+          <w:bCs/>
           <w:noProof/>
           <w:lang w:val="en-US"/>
         </w:rPr>
         <w:drawing>
-          <wp:anchor distT="0" distB="0" distL="114300" distR="114300" simplePos="0" relativeHeight="251658240" behindDoc="0" locked="0" layoutInCell="1" allowOverlap="1" wp14:anchorId="401B8DCD" wp14:editId="426F01C1">
-            <wp:simplePos x="0" y="0"/>
-            <wp:positionH relativeFrom="margin">
-              <wp:align>left</wp:align>
-            </wp:positionH>
-            <wp:positionV relativeFrom="margin">
-              <wp:posOffset>6573809</wp:posOffset>
-            </wp:positionV>
-            <wp:extent cx="5736590" cy="1295400"/>
+          <wp:inline distT="0" distB="0" distL="0" distR="0" wp14:anchorId="425A3599" wp14:editId="7DCE7303">
+            <wp:extent cx="4038600" cy="1662015"/>
             <wp:effectExtent l="0" t="0" r="0" b="0"/>
-            <wp:wrapSquare wrapText="bothSides"/>
-            <wp:docPr id="10" name="Picture 10"/>
+            <wp:docPr id="9" name="Picture 9"/>
             <wp:cNvGraphicFramePr>
               <a:graphicFrameLocks xmlns:a="http://schemas.openxmlformats.org/drawingml/2006/main" noChangeAspect="1"/>
             </wp:cNvGraphicFramePr>
@@ -2091,7 +2056,7 @@
               <a:graphicData uri="http://schemas.openxmlformats.org/drawingml/2006/picture">
                 <pic:pic xmlns:pic="http://schemas.openxmlformats.org/drawingml/2006/picture">
                   <pic:nvPicPr>
-                    <pic:cNvPr id="10" name="Screenshot (504).png"/>
+                    <pic:cNvPr id="9" name="Screenshot (538).png"/>
                     <pic:cNvPicPr/>
                   </pic:nvPicPr>
                   <pic:blipFill rotWithShape="1">
@@ -2102,13 +2067,13 @@
                         </a:ext>
                       </a:extLst>
                     </a:blip>
-                    <a:srcRect l="15621" t="65906" r="40871" b="16628"/>
+                    <a:srcRect l="20335" t="62515" r="40915" b="9135"/>
                     <a:stretch/>
                   </pic:blipFill>
                   <pic:spPr bwMode="auto">
                     <a:xfrm>
                       <a:off x="0" y="0"/>
-                      <a:ext cx="5736590" cy="1295400"/>
+                      <a:ext cx="4054346" cy="1668495"/>
                     </a:xfrm>
                     <a:prstGeom prst="rect">
                       <a:avLst/>
@@ -2125,22 +2090,33 @@
                 </pic:pic>
               </a:graphicData>
             </a:graphic>
-            <wp14:sizeRelH relativeFrom="margin">
-              <wp14:pctWidth>0</wp14:pctWidth>
-            </wp14:sizeRelH>
-            <wp14:sizeRelV relativeFrom="margin">
-              <wp14:pctHeight>0</wp14:pctHeight>
-            </wp14:sizeRelV>
-          </wp:anchor>
+          </wp:inline>
         </w:drawing>
       </w:r>
     </w:p>
     <w:p>
       <w:pPr>
-        <w:pStyle w:val="Heading2"/>
-        <w:keepNext w:val="0"/>
-        <w:keepLines w:val="0"/>
-        <w:spacing w:after="80"/>
+        <w:pStyle w:val="NoSpacing"/>
+        <w:rPr>
+          <w:noProof/>
+          <w:lang w:val="en-US"/>
+        </w:rPr>
+      </w:pPr>
+    </w:p>
+    <w:p>
+      <w:pPr>
+        <w:pStyle w:val="NoSpacing"/>
+        <w:rPr>
+          <w:noProof/>
+          <w:lang w:val="en-US"/>
+        </w:rPr>
+      </w:pPr>
+    </w:p>
+    <w:p>
+      <w:pPr>
+        <w:pStyle w:val="NoSpacing"/>
+      </w:pPr>
+      <w:r>
         <w:rPr>
           <w:b/>
           <w:bCs/>
@@ -2148,16 +2124,6 @@
           <w:szCs w:val="36"/>
           <w:lang w:val="en-GB"/>
         </w:rPr>
-      </w:pPr>
-      <w:r>
-        <w:rPr>
-          <w:b/>
-          <w:bCs/>
-          <w:sz w:val="36"/>
-          <w:szCs w:val="36"/>
-          <w:lang w:val="en-GB"/>
-        </w:rPr>
-        <w:lastRenderedPageBreak/>
         <w:t>Learning Outcomes</w:t>
       </w:r>
     </w:p>
@@ -2176,7 +2142,7 @@
         <w:rPr>
           <w:lang w:val="en-GB"/>
         </w:rPr>
-        <w:t>Trigger Lifecycle Mastery: Understanding the difference between statement-level and row-level triggers and when to use BEFORE vs AFTER events.</w:t>
+        <w:t>Package Structure Proficiency: Gained a clear understanding of the separation between the package specification (header) and the package body (implementation).</w:t>
       </w:r>
     </w:p>
     <w:p>
@@ -2194,7 +2160,7 @@
         <w:rPr>
           <w:lang w:val="en-GB"/>
         </w:rPr>
-        <w:t>Automated Data Calculation: Proficiency in using triggers to derive and populate column values, reducing the logic burden on the application layer.</w:t>
+        <w:t>Modular Programming Mastery: Learned to group related database operations into a single logical unit to improve maintainability and code organization.</w:t>
       </w:r>
     </w:p>
     <w:p>
@@ -2212,7 +2178,7 @@
         <w:rPr>
           <w:lang w:val="en-GB"/>
         </w:rPr>
-        <w:t>Custom Constraint Enforcement: Ability to implement complex business rules and validations that go beyond standard CHECK constraints.</w:t>
+        <w:t>Shared Resource Management: Expertise in utilizing shared cursors to reduce memory overhead and ensure consistent data fetching across multiple subprograms.</w:t>
       </w:r>
     </w:p>
     <w:p>
@@ -2230,21 +2196,8 @@
         <w:rPr>
           <w:lang w:val="en-GB"/>
         </w:rPr>
-        <w:t xml:space="preserve">Error Handling and </w:t>
-      </w:r>
-      <w:proofErr w:type="spellStart"/>
-      <w:r>
-        <w:rPr>
-          <w:lang w:val="en-GB"/>
-        </w:rPr>
-        <w:t>Signaling</w:t>
-      </w:r>
-      <w:proofErr w:type="spellEnd"/>
-      <w:r>
-        <w:rPr>
-          <w:lang w:val="en-GB"/>
-        </w:rPr>
-        <w:t>: Mastery of the RAISE EXCEPTION mechanism to communicate specific business logic failures to the user or application.</w:t>
+        <w:lastRenderedPageBreak/>
+        <w:t>Encapsulation and Security: Understood how packages provide a layer of abstraction by hiding complex implementation details from the calling environment.</w:t>
       </w:r>
     </w:p>
     <w:sectPr>
@@ -4807,73 +4760,73 @@
       </w:rPr>
     </w:lvl>
   </w:abstractNum>
-  <w:num w:numId="1" w16cid:durableId="1939022018">
+  <w:num w:numId="1" w16cid:durableId="2132548657">
     <w:abstractNumId w:val="15"/>
   </w:num>
-  <w:num w:numId="2" w16cid:durableId="258684744">
+  <w:num w:numId="2" w16cid:durableId="55014725">
     <w:abstractNumId w:val="14"/>
   </w:num>
-  <w:num w:numId="3" w16cid:durableId="1847936095">
+  <w:num w:numId="3" w16cid:durableId="621694590">
     <w:abstractNumId w:val="12"/>
   </w:num>
-  <w:num w:numId="4" w16cid:durableId="868952205">
+  <w:num w:numId="4" w16cid:durableId="260452376">
     <w:abstractNumId w:val="18"/>
   </w:num>
-  <w:num w:numId="5" w16cid:durableId="1402826873">
+  <w:num w:numId="5" w16cid:durableId="1985429917">
     <w:abstractNumId w:val="5"/>
   </w:num>
-  <w:num w:numId="6" w16cid:durableId="1139228901">
+  <w:num w:numId="6" w16cid:durableId="1173567934">
     <w:abstractNumId w:val="10"/>
   </w:num>
-  <w:num w:numId="7" w16cid:durableId="251935536">
+  <w:num w:numId="7" w16cid:durableId="1277105762">
     <w:abstractNumId w:val="7"/>
   </w:num>
-  <w:num w:numId="8" w16cid:durableId="1042291230">
+  <w:num w:numId="8" w16cid:durableId="458839036">
     <w:abstractNumId w:val="22"/>
   </w:num>
-  <w:num w:numId="9" w16cid:durableId="621107284">
+  <w:num w:numId="9" w16cid:durableId="1179193529">
     <w:abstractNumId w:val="11"/>
   </w:num>
-  <w:num w:numId="10" w16cid:durableId="420834300">
+  <w:num w:numId="10" w16cid:durableId="1433864800">
     <w:abstractNumId w:val="16"/>
   </w:num>
-  <w:num w:numId="11" w16cid:durableId="258833022">
+  <w:num w:numId="11" w16cid:durableId="1253473186">
     <w:abstractNumId w:val="13"/>
   </w:num>
-  <w:num w:numId="12" w16cid:durableId="1751586223">
+  <w:num w:numId="12" w16cid:durableId="1589846791">
     <w:abstractNumId w:val="3"/>
   </w:num>
-  <w:num w:numId="13" w16cid:durableId="1882010710">
+  <w:num w:numId="13" w16cid:durableId="484203540">
     <w:abstractNumId w:val="21"/>
   </w:num>
-  <w:num w:numId="14" w16cid:durableId="1250236287">
+  <w:num w:numId="14" w16cid:durableId="1404985766">
     <w:abstractNumId w:val="8"/>
   </w:num>
-  <w:num w:numId="15" w16cid:durableId="1478916551">
+  <w:num w:numId="15" w16cid:durableId="736827249">
     <w:abstractNumId w:val="2"/>
   </w:num>
-  <w:num w:numId="16" w16cid:durableId="1020158789">
+  <w:num w:numId="16" w16cid:durableId="805514782">
     <w:abstractNumId w:val="19"/>
   </w:num>
-  <w:num w:numId="17" w16cid:durableId="374157316">
+  <w:num w:numId="17" w16cid:durableId="419571564">
     <w:abstractNumId w:val="4"/>
   </w:num>
-  <w:num w:numId="18" w16cid:durableId="932124775">
+  <w:num w:numId="18" w16cid:durableId="765421668">
     <w:abstractNumId w:val="17"/>
   </w:num>
-  <w:num w:numId="19" w16cid:durableId="539704140">
+  <w:num w:numId="19" w16cid:durableId="955210139">
     <w:abstractNumId w:val="1"/>
   </w:num>
-  <w:num w:numId="20" w16cid:durableId="935211789">
+  <w:num w:numId="20" w16cid:durableId="967974264">
     <w:abstractNumId w:val="9"/>
   </w:num>
-  <w:num w:numId="21" w16cid:durableId="1520771877">
+  <w:num w:numId="21" w16cid:durableId="287316540">
     <w:abstractNumId w:val="0"/>
   </w:num>
-  <w:num w:numId="22" w16cid:durableId="649215531">
+  <w:num w:numId="22" w16cid:durableId="1251306055">
     <w:abstractNumId w:val="20"/>
   </w:num>
-  <w:num w:numId="23" w16cid:durableId="1056854215">
+  <w:num w:numId="23" w16cid:durableId="1310286173">
     <w:abstractNumId w:val="6"/>
   </w:num>
 </w:numbering>
@@ -4900,7 +4853,7 @@
     <w:lsdException w:name="Normal" w:uiPriority="0" w:qFormat="1"/>
     <w:lsdException w:name="heading 1" w:uiPriority="9" w:qFormat="1"/>
     <w:lsdException w:name="heading 2" w:semiHidden="1" w:uiPriority="0" w:unhideWhenUsed="1" w:qFormat="1"/>
-    <w:lsdException w:name="heading 3" w:semiHidden="1" w:uiPriority="9" w:unhideWhenUsed="1" w:qFormat="1"/>
+    <w:lsdException w:name="heading 3" w:semiHidden="1" w:uiPriority="0" w:unhideWhenUsed="1" w:qFormat="1"/>
     <w:lsdException w:name="heading 4" w:semiHidden="1" w:uiPriority="9" w:unhideWhenUsed="1" w:qFormat="1"/>
     <w:lsdException w:name="heading 5" w:semiHidden="1" w:uiPriority="9" w:unhideWhenUsed="1" w:qFormat="1"/>
     <w:lsdException w:name="heading 6" w:semiHidden="1" w:uiPriority="9" w:unhideWhenUsed="1" w:qFormat="1"/>
@@ -5312,6 +5265,7 @@
     <w:name w:val="heading 3"/>
     <w:basedOn w:val="Normal"/>
     <w:next w:val="Normal"/>
+    <w:link w:val="Heading3Char"/>
     <w:pPr>
       <w:keepNext/>
       <w:keepLines/>
@@ -5480,6 +5434,17 @@
         <w:insideV w:val="single" w:sz="4" w:space="0" w:color="auto"/>
       </w:tblBorders>
     </w:tblPr>
+  </w:style>
+  <w:style w:type="character" w:customStyle="1" w:styleId="Heading3Char">
+    <w:name w:val="Heading 3 Char"/>
+    <w:basedOn w:val="DefaultParagraphFont"/>
+    <w:link w:val="Heading3"/>
+    <w:rsid w:val="00A310BB"/>
+    <w:rPr>
+      <w:color w:val="434343"/>
+      <w:sz w:val="28"/>
+      <w:szCs w:val="28"/>
+    </w:rPr>
   </w:style>
 </w:styles>
 </file>

</xml_diff>